<commit_message>
Update product documentation to v1.1.0
Document material pipeline stats on indent creation and approval views,
pending-with approver visibility, server-side approval filtering, and
version display on login screen.
</commit_message>
<xml_diff>
--- a/ProCure_Product_Documentation.docx
+++ b/ProCure_Product_Documentation.docx
@@ -100,7 +100,7 @@
           <w:sz w:val="22"/>
           <w:szCs w:val="22"/>
         </w:rPr>
-        <w:t xml:space="preserve">Version 1.0  |  25 April 2026</w:t>
+        <w:t>Version 1.1.0  |  26 April 2026</w:t>
       </w:r>
     </w:p>
     <w:p>
@@ -5819,13 +5819,7 @@
         <w:spacing w:after="60"/>
       </w:pPr>
       <w:r>
-        <w:rPr>
-          <w:rFonts w:ascii="Calibri" w:cs="Calibri" w:eastAsia="Calibri" w:hAnsi="Calibri"/>
-          <w:color w:val="1E293B"/>
-          <w:sz w:val="21"/>
-          <w:szCs w:val="21"/>
-        </w:rPr>
-        <w:t xml:space="preserve">For each material added, the system displays current inventory stock at the site</w:t>
+        <w:t>For each material added, the system displays a comprehensive Material Status panel showing: current stock at site, total quantity indented to date, total quantity received via GRNs, quantity in transit (PO raised), quantity with procurement team, and quantity in other pending indents</w:t>
       </w:r>
     </w:p>
     <w:p>
@@ -6928,13 +6922,7 @@
         <w:spacing w:after="60"/>
       </w:pPr>
       <w:r>
-        <w:rPr>
-          <w:rFonts w:ascii="Calibri" w:cs="Calibri" w:eastAsia="Calibri" w:hAnsi="Calibri"/>
-          <w:color w:val="1E293B"/>
-          <w:sz w:val="21"/>
-          <w:szCs w:val="21"/>
-        </w:rPr>
-        <w:t xml:space="preserve">Material items table with quantity, unit, stock at creation, and current live stock</w:t>
+        <w:t>Material items table with columns: Requested quantity, Unit, Stock at Creation, Current Stock, Total Indented, Received, In Transit, With Procurement, and Other Pending Indents — with color-coded values and tooltip legend</w:t>
       </w:r>
     </w:p>
     <w:p>
@@ -6992,6 +6980,14 @@
           <w:szCs w:val="21"/>
         </w:rPr>
         <w:t xml:space="preserve">Action buttons contextually shown based on user role and indent status</w:t>
+      </w:r>
+    </w:p>
+    <w:p>
+      <w:pPr>
+        <w:pStyle w:val="ListParagraph"/>
+      </w:pPr>
+      <w:r>
+        <w:t>Pending With card displayed when indent is awaiting approval — shows the current approver's name, role, email (clickable), and phone number</w:t>
       </w:r>
     </w:p>
     <w:p>
@@ -8854,51 +8850,33 @@
         <w:spacing w:after="60"/>
       </w:pPr>
       <w:r>
-        <w:rPr>
-          <w:rFonts w:ascii="Calibri" w:cs="Calibri" w:eastAsia="Calibri" w:hAnsi="Calibri"/>
-          <w:color w:val="1E293B"/>
-          <w:sz w:val="21"/>
-          <w:szCs w:val="21"/>
-        </w:rPr>
-        <w:t xml:space="preserve">During indent creation: selecting a material triggers an API call to fetch current stock at the selected site</w:t>
-      </w:r>
-    </w:p>
-    <w:p>
-      <w:pPr>
-        <w:pStyle w:val="ListParagraph"/>
-        <w:numPr>
-          <w:ilvl w:val="0"/>
-          <w:numId w:val="1"/>
-        </w:numPr>
-        <w:spacing w:after="60"/>
-      </w:pPr>
-      <w:r>
-        <w:rPr>
-          <w:rFonts w:ascii="Calibri" w:cs="Calibri" w:eastAsia="Calibri" w:hAnsi="Calibri"/>
-          <w:color w:val="1E293B"/>
-          <w:sz w:val="21"/>
-          <w:szCs w:val="21"/>
-        </w:rPr>
-        <w:t xml:space="preserve">Stock is displayed inline next to each material row with color coding (green for positive, orange for zero)</w:t>
-      </w:r>
-    </w:p>
-    <w:p>
-      <w:pPr>
-        <w:pStyle w:val="ListParagraph"/>
-        <w:numPr>
-          <w:ilvl w:val="0"/>
-          <w:numId w:val="1"/>
-        </w:numPr>
-        <w:spacing w:after="60"/>
-      </w:pPr>
-      <w:r>
-        <w:rPr>
-          <w:rFonts w:ascii="Calibri" w:cs="Calibri" w:eastAsia="Calibri" w:hAnsi="Calibri"/>
-          <w:color w:val="1E293B"/>
-          <w:sz w:val="21"/>
-          <w:szCs w:val="21"/>
-        </w:rPr>
-        <w:t xml:space="preserve">During approval: both stock-at-creation and current-live-stock are shown side-by-side for each material</w:t>
+        <w:t>During indent creation: selecting a material triggers parallel API calls to fetch current stock and material pipeline statistics (total indented, received, in transit, with procurement, other pending indents) for the selected site</w:t>
+      </w:r>
+    </w:p>
+    <w:p>
+      <w:pPr>
+        <w:pStyle w:val="ListParagraph"/>
+        <w:numPr>
+          <w:ilvl w:val="0"/>
+          <w:numId w:val="1"/>
+        </w:numPr>
+        <w:spacing w:after="60"/>
+      </w:pPr>
+      <w:r>
+        <w:t>A Material Status panel is displayed for each material showing all six metrics in a structured grid with color coding (green for received, blue for in transit, amber for with procurement, purple for other pending indents)</w:t>
+      </w:r>
+    </w:p>
+    <w:p>
+      <w:pPr>
+        <w:pStyle w:val="ListParagraph"/>
+        <w:numPr>
+          <w:ilvl w:val="0"/>
+          <w:numId w:val="1"/>
+        </w:numPr>
+        <w:spacing w:after="60"/>
+      </w:pPr>
+      <w:r>
+        <w:t>During approval: the material items table shows stock-at-creation, current-live-stock, plus five pipeline columns with a tooltip legend explaining each metric</w:t>
       </w:r>
     </w:p>
     <w:p>
@@ -9492,13 +9470,7 @@
         <w:spacing w:after="60"/>
       </w:pPr>
       <w:r>
-        <w:rPr>
-          <w:rFonts w:ascii="Calibri" w:cs="Calibri" w:eastAsia="Calibri" w:hAnsi="Calibri"/>
-          <w:color w:val="1E293B"/>
-          <w:sz w:val="21"/>
-          <w:szCs w:val="21"/>
-        </w:rPr>
-        <w:t xml:space="preserve">Pending approval + matching approver role: Approve and Reject buttons with remarks textarea</w:t>
+        <w:t>Pending approval + current workflow step matches user role: Approve and Reject buttons with remarks textarea (server-validated, not just role-based)</w:t>
       </w:r>
     </w:p>
     <w:p>
@@ -14269,15 +14241,7 @@
         <w:spacing w:after="150" w:before="300"/>
       </w:pPr>
       <w:r>
-        <w:rPr>
-          <w:rFonts w:ascii="Calibri" w:cs="Calibri" w:eastAsia="Calibri" w:hAnsi="Calibri"/>
-          <w:b/>
-          <w:bCs/>
-          <w:color w:val="2563EB"/>
-          <w:sz w:val="26"/>
-          <w:szCs w:val="26"/>
-        </w:rPr>
-        <w:t xml:space="preserve">13.3 Inventory (2 endpoints)</w:t>
+        <w:t>13.3 Inventory &amp; Material Stats (3 endpoints)</w:t>
       </w:r>
     </w:p>
     <w:tbl>
@@ -17196,13 +17160,7 @@
         <w:spacing w:after="60"/>
       </w:pPr>
       <w:r>
-        <w:rPr>
-          <w:rFonts w:ascii="Calibri" w:cs="Calibri" w:eastAsia="Calibri" w:hAnsi="Calibri"/>
-          <w:color w:val="1E293B"/>
-          <w:sz w:val="21"/>
-          <w:szCs w:val="21"/>
-        </w:rPr>
-        <w:t xml:space="preserve">/login - Email/password login with error handling and redirect</w:t>
+        <w:t>/login - Authentication page with email/password form, ProCure branding, and version number display</w:t>
       </w:r>
     </w:p>
     <w:p>
@@ -17278,13 +17236,7 @@
         <w:spacing w:after="60"/>
       </w:pPr>
       <w:r>
-        <w:rPr>
-          <w:rFonts w:ascii="Calibri" w:cs="Calibri" w:eastAsia="Calibri" w:hAnsi="Calibri"/>
-          <w:color w:val="1E293B"/>
-          <w:sz w:val="21"/>
-          <w:szCs w:val="21"/>
-        </w:rPr>
-        <w:t xml:space="preserve">/indents - Indent list with status filtering, role-based action visibility</w:t>
+        <w:t>/indents - Indent list with filtering by status, showing Pending With column (approver name and role)</w:t>
       </w:r>
     </w:p>
     <w:p>
@@ -17357,13 +17309,7 @@
         <w:spacing w:after="60"/>
       </w:pPr>
       <w:r>
-        <w:rPr>
-          <w:rFonts w:ascii="Calibri" w:cs="Calibri" w:eastAsia="Calibri" w:hAnsi="Calibri"/>
-          <w:color w:val="1E293B"/>
-          <w:sz w:val="21"/>
-          <w:szCs w:val="21"/>
-        </w:rPr>
-        <w:t xml:space="preserve">/approvals - Pending approvals queue showing indents awaiting the current user's action</w:t>
+        <w:t>/approvals - Pending approvals queue filtered server-side to show only indents at the current user's approval step (not all pending indents)</w:t>
       </w:r>
     </w:p>
     <w:p>
@@ -20624,13 +20570,7 @@
         <w:spacing w:after="60"/>
       </w:pPr>
       <w:r>
-        <w:rPr>
-          <w:rFonts w:ascii="Calibri" w:cs="Calibri" w:eastAsia="Calibri" w:hAnsi="Calibri"/>
-          <w:color w:val="1E293B"/>
-          <w:sz w:val="21"/>
-          <w:szCs w:val="21"/>
-        </w:rPr>
-        <w:t xml:space="preserve">System shows current stock: 500 bags cement, 40 tonnes steel already at site</w:t>
+        <w:t>System shows Material Status panel: current stock (500 bags cement, 40 tonnes steel), plus total indented, received, in transit, with procurement, and other pending indent quantities</w:t>
       </w:r>
     </w:p>
     <w:p>
@@ -20722,13 +20662,7 @@
         <w:spacing w:after="60"/>
       </w:pPr>
       <w:r>
-        <w:rPr>
-          <w:rFonts w:ascii="Calibri" w:cs="Calibri" w:eastAsia="Calibri" w:hAnsi="Calibri"/>
-          <w:color w:val="1E293B"/>
-          <w:sz w:val="21"/>
-          <w:szCs w:val="21"/>
-        </w:rPr>
-        <w:t xml:space="preserve">Reviews material quantities and current inventory levels</w:t>
+        <w:t>Reviews material items table with full pipeline visibility: current stock, total indented, received, in transit, with procurement, and other pending indents</w:t>
       </w:r>
     </w:p>
     <w:p>

</xml_diff>